<commit_message>
Decided JAX is terrible
fixed stuff
</commit_message>
<xml_diff>
--- a/Abstract/Abstract Draft.docx
+++ b/Abstract/Abstract Draft.docx
@@ -1,6 +1,6 @@
 
 <file path=word/document.xml><?xml version="1.0" encoding="utf-8"?>
-<w:document xmlns:wpc="http://schemas.microsoft.com/office/word/2010/wordprocessingCanvas" xmlns:cx="http://schemas.microsoft.com/office/drawing/2014/chartex" xmlns:cx1="http://schemas.microsoft.com/office/drawing/2015/9/8/chartex" xmlns:cx2="http://schemas.microsoft.com/office/drawing/2015/10/21/chartex" xmlns:cx3="http://schemas.microsoft.com/office/drawing/2016/5/9/chartex" xmlns:cx4="http://schemas.microsoft.com/office/drawing/2016/5/10/chartex" xmlns:cx5="http://schemas.microsoft.com/office/drawing/2016/5/11/chartex" xmlns:cx6="http://schemas.microsoft.com/office/drawing/2016/5/12/chartex" xmlns:cx7="http://schemas.microsoft.com/office/drawing/2016/5/13/chartex" xmlns:cx8="http://schemas.microsoft.com/office/drawing/2016/5/14/chartex" xmlns:mc="http://schemas.openxmlformats.org/markup-compatibility/2006" xmlns:aink="http://schemas.microsoft.com/office/drawing/2016/ink" xmlns:am3d="http://schemas.microsoft.com/office/drawing/2017/model3d" xmlns:o="urn:schemas-microsoft-com:office:office" xmlns:oel="http://schemas.microsoft.com/office/2019/extlst" xmlns:r="http://schemas.openxmlformats.org/officeDocument/2006/relationships" xmlns:m="http://schemas.openxmlformats.org/officeDocument/2006/math" xmlns:v="urn:schemas-microsoft-com:vml" xmlns:wp14="http://schemas.microsoft.com/office/word/2010/wordprocessingDrawing" xmlns:wp="http://schemas.openxmlformats.org/drawingml/2006/wordprocessingDrawing" xmlns:w10="urn:schemas-microsoft-com:office:word" xmlns:w="http://schemas.openxmlformats.org/wordprocessingml/2006/main" xmlns:w14="http://schemas.microsoft.com/office/word/2010/wordml" xmlns:w15="http://schemas.microsoft.com/office/word/2012/wordml" xmlns:w16cex="http://schemas.microsoft.com/office/word/2018/wordml/cex" xmlns:w16cid="http://schemas.microsoft.com/office/word/2016/wordml/cid" xmlns:w16="http://schemas.microsoft.com/office/word/2018/wordml" xmlns:w16du="http://schemas.microsoft.com/office/word/2023/wordml/word16du" xmlns:w16sdtdh="http://schemas.microsoft.com/office/word/2020/wordml/sdtdatahash" xmlns:w16se="http://schemas.microsoft.com/office/word/2015/wordml/symex" xmlns:wpg="http://schemas.microsoft.com/office/word/2010/wordprocessingGroup" xmlns:wpi="http://schemas.microsoft.com/office/word/2010/wordprocessingInk" xmlns:wne="http://schemas.microsoft.com/office/word/2006/wordml" xmlns:wps="http://schemas.microsoft.com/office/word/2010/wordprocessingShape" mc:Ignorable="w14 w15 w16se w16cid w16 w16cex w16sdtdh w16du wp14">
+<w:document xmlns:wpc="http://schemas.microsoft.com/office/word/2010/wordprocessingCanvas" xmlns:cx="http://schemas.microsoft.com/office/drawing/2014/chartex" xmlns:cx1="http://schemas.microsoft.com/office/drawing/2015/9/8/chartex" xmlns:cx2="http://schemas.microsoft.com/office/drawing/2015/10/21/chartex" xmlns:cx3="http://schemas.microsoft.com/office/drawing/2016/5/9/chartex" xmlns:cx4="http://schemas.microsoft.com/office/drawing/2016/5/10/chartex" xmlns:cx5="http://schemas.microsoft.com/office/drawing/2016/5/11/chartex" xmlns:cx6="http://schemas.microsoft.com/office/drawing/2016/5/12/chartex" xmlns:cx7="http://schemas.microsoft.com/office/drawing/2016/5/13/chartex" xmlns:cx8="http://schemas.microsoft.com/office/drawing/2016/5/14/chartex" xmlns:mc="http://schemas.openxmlformats.org/markup-compatibility/2006" xmlns:aink="http://schemas.microsoft.com/office/drawing/2016/ink" xmlns:am3d="http://schemas.microsoft.com/office/drawing/2017/model3d" xmlns:o="urn:schemas-microsoft-com:office:office" xmlns:oel="http://schemas.microsoft.com/office/2019/extlst" xmlns:r="http://schemas.openxmlformats.org/officeDocument/2006/relationships" xmlns:m="http://schemas.openxmlformats.org/officeDocument/2006/math" xmlns:v="urn:schemas-microsoft-com:vml" xmlns:wp14="http://schemas.microsoft.com/office/word/2010/wordprocessingDrawing" xmlns:wp="http://schemas.openxmlformats.org/drawingml/2006/wordprocessingDrawing" xmlns:w10="urn:schemas-microsoft-com:office:word" xmlns:w="http://schemas.openxmlformats.org/wordprocessingml/2006/main" xmlns:w14="http://schemas.microsoft.com/office/word/2010/wordml" xmlns:w15="http://schemas.microsoft.com/office/word/2012/wordml" xmlns:w16cex="http://schemas.microsoft.com/office/word/2018/wordml/cex" xmlns:w16cid="http://schemas.microsoft.com/office/word/2016/wordml/cid" xmlns:w16="http://schemas.microsoft.com/office/word/2018/wordml" xmlns:w16du="http://schemas.microsoft.com/office/word/2023/wordml/word16du" xmlns:w16sdtdh="http://schemas.microsoft.com/office/word/2020/wordml/sdtdatahash" xmlns:w16sdtfl="http://schemas.microsoft.com/office/word/2024/wordml/sdtformatlock" xmlns:w16se="http://schemas.microsoft.com/office/word/2015/wordml/symex" xmlns:wpg="http://schemas.microsoft.com/office/word/2010/wordprocessingGroup" xmlns:wpi="http://schemas.microsoft.com/office/word/2010/wordprocessingInk" xmlns:wne="http://schemas.microsoft.com/office/word/2006/wordml" xmlns:wps="http://schemas.microsoft.com/office/word/2010/wordprocessingShape" mc:Ignorable="w14 w15 w16se w16cid w16 w16cex w16sdtdh w16sdtfl w16du wp14">
   <w:body>
     <w:p>
       <w:pPr>
@@ -65,7 +65,13 @@
         <w:framePr w:wrap="notBeside" w:x="1614"/>
       </w:pPr>
       <w:r>
-        <w:t>Rollo D. L. Tully</w:t>
+        <w:t>Rollo</w:t>
+      </w:r>
+      <w:r>
+        <w:t>scates</w:t>
+      </w:r>
+      <w:r>
+        <w:t xml:space="preserve"> D. L. Tully</w:t>
       </w:r>
       <w:r>
         <w:t>, University of Manchester, MAE</w:t>
@@ -2579,6 +2585,7 @@
       <w:pPr>
         <w:pStyle w:val="Heading2"/>
       </w:pPr>
+      <w:commentRangeStart w:id="0"/>
       <w:r>
         <w:t>ADAM</w:t>
       </w:r>
@@ -2653,6 +2660,16 @@
         <w:tab/>
         <w:t>ADAMs has been chosen as it has been shown to efficiently converge for noisy objective functions in a large parameter space such as the one[6].</w:t>
       </w:r>
+      <w:commentRangeEnd w:id="0"/>
+      <w:r>
+        <w:rPr>
+          <w:rStyle w:val="CommentReference"/>
+          <w:rFonts w:asciiTheme="minorHAnsi" w:eastAsiaTheme="minorHAnsi" w:hAnsiTheme="minorHAnsi" w:cstheme="minorBidi"/>
+          <w:kern w:val="2"/>
+          <w14:ligatures w14:val="standardContextual"/>
+        </w:rPr>
+        <w:commentReference w:id="0"/>
+      </w:r>
     </w:p>
     <w:p>
       <w:pPr>
@@ -2681,7 +2698,15 @@
         <w:t xml:space="preserve"> </w:t>
       </w:r>
       <w:r>
-        <w:t>Shum, J.G. and Lee, S., 2024. Computational Study of Airfoil Design Parameters and Sensitivity Analysis for Dynamic Stall. </w:t>
+        <w:t xml:space="preserve">Shum, J.G. and Lee, S., 2024. Computational Study of </w:t>
+      </w:r>
+      <w:proofErr w:type="spellStart"/>
+      <w:r>
+        <w:t>Airfoil</w:t>
+      </w:r>
+      <w:proofErr w:type="spellEnd"/>
+      <w:r>
+        <w:t xml:space="preserve"> Design Parameters and Sensitivity Analysis for Dynamic Stall. </w:t>
       </w:r>
       <w:r>
         <w:rPr>
@@ -2709,30 +2734,74 @@
       <w:r>
         <w:t xml:space="preserve"> at: </w:t>
       </w:r>
-      <w:hyperlink r:id="rId14" w:history="1">
+      <w:hyperlink r:id="rId18" w:history="1">
         <w:r>
           <w:rPr>
             <w:rStyle w:val="Hyperlink"/>
           </w:rPr>
-          <w:t>https://arc.aiaa.org/doi/fu</w:t>
+          <w:t>https://arc.aiaa.org/doi/full/10.2514/1.J063474</w:t>
         </w:r>
+      </w:hyperlink>
+      <w:r>
+        <w:rPr>
+          <w:rStyle w:val="Hyperlink"/>
+          <w:u w:val="none"/>
+        </w:rPr>
+        <w:t xml:space="preserve"> </w:t>
+      </w:r>
+      <w:r>
+        <w:t>(Accessed: 02/12/24)</w:t>
+      </w:r>
+    </w:p>
+    <w:p/>
+    <w:p>
+      <w:pPr>
+        <w:rPr>
+          <w:rStyle w:val="Hyperlink"/>
+          <w:u w:val="none"/>
+        </w:rPr>
+      </w:pPr>
+      <w:r>
+        <w:t>[2]</w:t>
+      </w:r>
+      <w:r>
+        <w:t xml:space="preserve"> </w:t>
+      </w:r>
+      <w:proofErr w:type="spellStart"/>
+      <w:r>
+        <w:t>CNCMultitool</w:t>
+      </w:r>
+      <w:proofErr w:type="spellEnd"/>
+      <w:r>
+        <w:t xml:space="preserve">. </w:t>
+      </w:r>
+      <w:r>
+        <w:t xml:space="preserve">2024. </w:t>
+      </w:r>
+      <w:r>
+        <w:rPr>
+          <w:i/>
+          <w:iCs/>
+        </w:rPr>
+        <w:t>CNC Hot wire cutting machine entry series cut 1610</w:t>
+      </w:r>
+      <w:r>
+        <w:t>. Available at :</w:t>
+      </w:r>
+      <w:r>
+        <w:t xml:space="preserve"> </w:t>
+      </w:r>
+      <w:hyperlink r:id="rId19" w:history="1">
         <w:r>
           <w:rPr>
             <w:rStyle w:val="Hyperlink"/>
           </w:rPr>
-          <w:t>l</w:t>
-        </w:r>
-        <w:r>
-          <w:rPr>
-            <w:rStyle w:val="Hyperlink"/>
-          </w:rPr>
-          <w:t>l/10.2514/1.J063474</w:t>
+          <w:t>https://www.cnc-multitool.com/cnc-hot-wire-cutting-machine-entry-series-cut1610s.html</w:t>
         </w:r>
       </w:hyperlink>
       <w:r>
         <w:rPr>
           <w:rStyle w:val="Hyperlink"/>
-          <w:u w:val="none"/>
         </w:rPr>
         <w:t xml:space="preserve"> </w:t>
       </w:r>
@@ -2742,100 +2811,42 @@
     </w:p>
     <w:p/>
     <w:p>
-      <w:pPr>
-        <w:rPr>
-          <w:rStyle w:val="Hyperlink"/>
-          <w:u w:val="none"/>
-        </w:rPr>
-      </w:pPr>
-      <w:r>
-        <w:t>[2]</w:t>
-      </w:r>
-      <w:r>
+      <w:r>
+        <w:t>[3]</w:t>
+      </w:r>
+      <w:r>
+        <w:rPr>
+          <w:color w:val="222222"/>
+          <w:shd w:val="clear" w:color="auto" w:fill="FFFFFF"/>
+        </w:rPr>
         <w:t xml:space="preserve"> </w:t>
       </w:r>
       <w:r>
-        <w:t xml:space="preserve">CNCMultitool. </w:t>
-      </w:r>
-      <w:r>
-        <w:rPr>
-          <w:lang w:val="it-IT"/>
-        </w:rPr>
-        <w:t xml:space="preserve">2024. </w:t>
+        <w:t xml:space="preserve">Selig, M.S. and Guglielmo, J.J., 1997. High-lift low Reynolds number </w:t>
+      </w:r>
+      <w:proofErr w:type="spellStart"/>
+      <w:r>
+        <w:t>airfoil</w:t>
+      </w:r>
+      <w:proofErr w:type="spellEnd"/>
+      <w:r>
+        <w:t xml:space="preserve"> design. </w:t>
       </w:r>
       <w:r>
         <w:rPr>
           <w:i/>
           <w:iCs/>
         </w:rPr>
-        <w:t>CNC Hot wire cutting machine entry series cut 1610</w:t>
-      </w:r>
-      <w:r>
-        <w:t>. Available at :</w:t>
-      </w:r>
-      <w:r>
-        <w:t xml:space="preserve"> </w:t>
-      </w:r>
-      <w:hyperlink r:id="rId15" w:history="1">
-        <w:r>
-          <w:rPr>
-            <w:rStyle w:val="Hyperlink"/>
-          </w:rPr>
-          <w:t>https://w</w:t>
-        </w:r>
-        <w:r>
-          <w:rPr>
-            <w:rStyle w:val="Hyperlink"/>
-          </w:rPr>
-          <w:t>w</w:t>
-        </w:r>
-        <w:r>
-          <w:rPr>
-            <w:rStyle w:val="Hyperlink"/>
-          </w:rPr>
-          <w:t>w.cnc-multitool.com/cnc-hot-wire-cutting-machine-entry-series-cut1610s.html</w:t>
-        </w:r>
-      </w:hyperlink>
-      <w:r>
-        <w:rPr>
-          <w:rStyle w:val="Hyperlink"/>
-        </w:rPr>
-        <w:t xml:space="preserve"> </w:t>
-      </w:r>
-      <w:r>
-        <w:t>(Accessed: 02/12/24)</w:t>
-      </w:r>
-    </w:p>
-    <w:p/>
-    <w:p>
-      <w:r>
-        <w:t>[3]</w:t>
-      </w:r>
-      <w:r>
-        <w:rPr>
-          <w:color w:val="222222"/>
-          <w:shd w:val="clear" w:color="auto" w:fill="FFFFFF"/>
-        </w:rPr>
-        <w:t xml:space="preserve"> </w:t>
-      </w:r>
-      <w:r>
-        <w:t>Selig, M.S. and Guglielmo, J.J., 1997. High-lift low Reynolds number airfoil design. </w:t>
+        <w:t>Journal of aircraft</w:t>
+      </w:r>
+      <w:r>
+        <w:t>, </w:t>
       </w:r>
       <w:r>
         <w:rPr>
           <w:i/>
           <w:iCs/>
         </w:rPr>
-        <w:t>Journal of aircraft</w:t>
-      </w:r>
-      <w:r>
-        <w:t>, </w:t>
-      </w:r>
-      <w:r>
-        <w:rPr>
-          <w:i/>
-          <w:iCs/>
-        </w:rPr>
         <w:t>34</w:t>
       </w:r>
       <w:r>
@@ -2850,7 +2861,7 @@
       <w:r>
         <w:t xml:space="preserve"> at : </w:t>
       </w:r>
-      <w:hyperlink r:id="rId16" w:history="1">
+      <w:hyperlink r:id="rId20" w:history="1">
         <w:r>
           <w:rPr>
             <w:rStyle w:val="Hyperlink"/>
@@ -2874,125 +2885,111 @@
     <w:p/>
     <w:p>
       <w:r>
-        <w:rPr>
-          <w:lang w:val="de-DE"/>
-        </w:rPr>
         <w:t>[4]</w:t>
       </w:r>
       <w:r>
-        <w:rPr>
-          <w:lang w:val="de-DE"/>
-        </w:rPr>
         <w:t xml:space="preserve"> </w:t>
       </w:r>
-      <w:r>
-        <w:rPr>
-          <w:lang w:val="de-DE"/>
-        </w:rPr>
-        <w:t xml:space="preserve">EinScan(2024). </w:t>
-      </w:r>
+      <w:proofErr w:type="spellStart"/>
+      <w:r>
+        <w:t>EinScan</w:t>
+      </w:r>
+      <w:proofErr w:type="spellEnd"/>
+      <w:r>
+        <w:t xml:space="preserve">(2024). </w:t>
+      </w:r>
+      <w:proofErr w:type="spellStart"/>
       <w:r>
         <w:rPr>
           <w:i/>
           <w:iCs/>
         </w:rPr>
-        <w:t xml:space="preserve">EinScan HX. </w:t>
-      </w:r>
-      <w:r>
-        <w:t>Available at :</w:t>
-      </w:r>
+        <w:t>EinScan</w:t>
+      </w:r>
+      <w:proofErr w:type="spellEnd"/>
       <w:r>
         <w:rPr>
           <w:i/>
           <w:iCs/>
         </w:rPr>
+        <w:t xml:space="preserve"> HX. </w:t>
+      </w:r>
+      <w:r>
+        <w:t>Available at :</w:t>
+      </w:r>
+      <w:r>
+        <w:rPr>
+          <w:i/>
+          <w:iCs/>
+        </w:rPr>
         <w:t xml:space="preserve"> </w:t>
       </w:r>
-      <w:hyperlink r:id="rId17" w:history="1">
+      <w:hyperlink r:id="rId21" w:history="1">
         <w:r>
           <w:rPr>
             <w:rStyle w:val="Hyperlink"/>
           </w:rPr>
-          <w:t>https://www.einscan.com</w:t>
+          <w:t>https://www.einscan.com/einscan-hx/</w:t>
         </w:r>
+      </w:hyperlink>
+      <w:r>
+        <w:t xml:space="preserve"> (</w:t>
+      </w:r>
+      <w:r>
+        <w:t xml:space="preserve">Accessed: </w:t>
+      </w:r>
+      <w:r>
+        <w:t>02/12/24)</w:t>
+      </w:r>
+    </w:p>
+    <w:p/>
+    <w:p>
+      <w:pPr>
+        <w:rPr>
+          <w:rStyle w:val="Hyperlink"/>
+        </w:rPr>
+      </w:pPr>
+      <w:r>
+        <w:t>[</w:t>
+      </w:r>
+      <w:r>
+        <w:t>5</w:t>
+      </w:r>
+      <w:r>
+        <w:t>]</w:t>
+      </w:r>
+      <w:r>
+        <w:t>u</w:t>
+      </w:r>
+      <w:r>
+        <w:t xml:space="preserve">XFLR5(2024). </w:t>
+      </w:r>
+      <w:r>
+        <w:t>Xflr5(</w:t>
+      </w:r>
+      <w:proofErr w:type="spellStart"/>
+      <w:r>
+        <w:t>Verson</w:t>
+      </w:r>
+      <w:proofErr w:type="spellEnd"/>
+      <w:r>
+        <w:t xml:space="preserve"> 6.59). </w:t>
+      </w:r>
+      <w:r>
+        <w:t>[Computer program]. Available at:</w:t>
+      </w:r>
+      <w:r>
+        <w:t xml:space="preserve"> </w:t>
+      </w:r>
+      <w:hyperlink r:id="rId22" w:history="1">
         <w:r>
           <w:rPr>
             <w:rStyle w:val="Hyperlink"/>
           </w:rPr>
-          <w:t>/</w:t>
-        </w:r>
-        <w:r>
-          <w:rPr>
-            <w:rStyle w:val="Hyperlink"/>
-          </w:rPr>
-          <w:t>einscan-hx/</w:t>
+          <w:t>https://www.xflr5.tech/xflr5.htm</w:t>
         </w:r>
       </w:hyperlink>
       <w:r>
-        <w:t xml:space="preserve"> (</w:t>
-      </w:r>
-      <w:r>
-        <w:t xml:space="preserve">Accessed: </w:t>
-      </w:r>
-      <w:r>
-        <w:t>02/12/24)</w:t>
-      </w:r>
-    </w:p>
-    <w:p/>
-    <w:p>
-      <w:pPr>
-        <w:rPr>
-          <w:rStyle w:val="Hyperlink"/>
-        </w:rPr>
-      </w:pPr>
-      <w:r>
-        <w:t>[</w:t>
-      </w:r>
-      <w:r>
-        <w:t>5</w:t>
-      </w:r>
-      <w:r>
-        <w:t>]</w:t>
-      </w:r>
-      <w:r>
-        <w:t>u</w:t>
-      </w:r>
-      <w:r>
-        <w:t xml:space="preserve">XFLR5(2024). </w:t>
-      </w:r>
-      <w:r>
-        <w:rPr>
-          <w:lang w:val="de-DE"/>
-        </w:rPr>
-        <w:t xml:space="preserve">Xflr5(Verson 6.59). </w:t>
-      </w:r>
-      <w:r>
-        <w:t>[Computer program]. Available at:</w:t>
-      </w:r>
-      <w:r>
-        <w:t xml:space="preserve"> </w:t>
-      </w:r>
-      <w:hyperlink r:id="rId18" w:history="1">
-        <w:r>
-          <w:rPr>
-            <w:rStyle w:val="Hyperlink"/>
-          </w:rPr>
-          <w:t>https://www.xflr</w:t>
-        </w:r>
-        <w:r>
-          <w:rPr>
-            <w:rStyle w:val="Hyperlink"/>
-          </w:rPr>
-          <w:t>5</w:t>
-        </w:r>
-        <w:r>
-          <w:rPr>
-            <w:rStyle w:val="Hyperlink"/>
-          </w:rPr>
-          <w:t>.tech/xflr5.htm</w:t>
-        </w:r>
-      </w:hyperlink>
-      <w:r>
         <w:rPr>
           <w:rStyle w:val="Hyperlink"/>
           <w:u w:val="none"/>
@@ -3009,20 +3006,23 @@
         <w:t>[6]</w:t>
       </w:r>
       <w:r>
-        <w:t xml:space="preserve"> </w:t>
-      </w:r>
-      <w:r>
-        <w:t>Kingma, D.P., 2014. Adam: A method for stochastic optimization. </w:t>
-      </w:r>
-      <w:r>
-        <w:t xml:space="preserve">Available at: </w:t>
-      </w:r>
+        <w:t xml:space="preserve"> Kingma, D.P., 2014. Adam: A method for stochastic optimization. Available at: </w:t>
+      </w:r>
+      <w:proofErr w:type="spellStart"/>
       <w:r>
         <w:rPr>
           <w:i/>
           <w:iCs/>
         </w:rPr>
-        <w:t>arXiv preprint arXiv:1412.6980</w:t>
+        <w:t>arXiv</w:t>
+      </w:r>
+      <w:proofErr w:type="spellEnd"/>
+      <w:r>
+        <w:rPr>
+          <w:i/>
+          <w:iCs/>
+        </w:rPr>
+        <w:t xml:space="preserve"> preprint arXiv:1412.6980</w:t>
       </w:r>
       <w:r>
         <w:t>.</w:t>
@@ -3030,7 +3030,7 @@
       <w:r>
         <w:t xml:space="preserve"> </w:t>
       </w:r>
-      <w:hyperlink r:id="rId19" w:history="1">
+      <w:hyperlink r:id="rId23" w:history="1">
         <w:r>
           <w:rPr>
             <w:rStyle w:val="Hyperlink"/>
@@ -3043,7 +3043,7 @@
       </w:r>
     </w:p>
     <w:sectPr>
-      <w:headerReference w:type="default" r:id="rId20"/>
+      <w:headerReference w:type="default" r:id="rId24"/>
       <w:pgSz w:w="12240" w:h="15840" w:code="1"/>
       <w:pgMar w:top="1080" w:right="1080" w:bottom="1080" w:left="1080" w:header="432" w:footer="432" w:gutter="0"/>
       <w:cols w:num="2" w:space="288"/>
@@ -3053,8 +3053,47 @@
 </w:document>
 </file>
 
+<file path=word/comments.xml><?xml version="1.0" encoding="utf-8"?>
+<w:comments xmlns:wpc="http://schemas.microsoft.com/office/word/2010/wordprocessingCanvas" xmlns:cx="http://schemas.microsoft.com/office/drawing/2014/chartex" xmlns:cx1="http://schemas.microsoft.com/office/drawing/2015/9/8/chartex" xmlns:cx2="http://schemas.microsoft.com/office/drawing/2015/10/21/chartex" xmlns:cx3="http://schemas.microsoft.com/office/drawing/2016/5/9/chartex" xmlns:cx4="http://schemas.microsoft.com/office/drawing/2016/5/10/chartex" xmlns:cx5="http://schemas.microsoft.com/office/drawing/2016/5/11/chartex" xmlns:cx6="http://schemas.microsoft.com/office/drawing/2016/5/12/chartex" xmlns:cx7="http://schemas.microsoft.com/office/drawing/2016/5/13/chartex" xmlns:cx8="http://schemas.microsoft.com/office/drawing/2016/5/14/chartex" xmlns:mc="http://schemas.openxmlformats.org/markup-compatibility/2006" xmlns:aink="http://schemas.microsoft.com/office/drawing/2016/ink" xmlns:am3d="http://schemas.microsoft.com/office/drawing/2017/model3d" xmlns:o="urn:schemas-microsoft-com:office:office" xmlns:oel="http://schemas.microsoft.com/office/2019/extlst" xmlns:r="http://schemas.openxmlformats.org/officeDocument/2006/relationships" xmlns:m="http://schemas.openxmlformats.org/officeDocument/2006/math" xmlns:v="urn:schemas-microsoft-com:vml" xmlns:wp14="http://schemas.microsoft.com/office/word/2010/wordprocessingDrawing" xmlns:wp="http://schemas.openxmlformats.org/drawingml/2006/wordprocessingDrawing" xmlns:w10="urn:schemas-microsoft-com:office:word" xmlns:w="http://schemas.openxmlformats.org/wordprocessingml/2006/main" xmlns:w14="http://schemas.microsoft.com/office/word/2010/wordml" xmlns:w15="http://schemas.microsoft.com/office/word/2012/wordml" xmlns:w16cex="http://schemas.microsoft.com/office/word/2018/wordml/cex" xmlns:w16cid="http://schemas.microsoft.com/office/word/2016/wordml/cid" xmlns:w16="http://schemas.microsoft.com/office/word/2018/wordml" xmlns:w16du="http://schemas.microsoft.com/office/word/2023/wordml/word16du" xmlns:w16sdtdh="http://schemas.microsoft.com/office/word/2020/wordml/sdtdatahash" xmlns:w16sdtfl="http://schemas.microsoft.com/office/word/2024/wordml/sdtformatlock" xmlns:w16se="http://schemas.microsoft.com/office/word/2015/wordml/symex" xmlns:wpg="http://schemas.microsoft.com/office/word/2010/wordprocessingGroup" xmlns:wpi="http://schemas.microsoft.com/office/word/2010/wordprocessingInk" xmlns:wne="http://schemas.microsoft.com/office/word/2006/wordml" xmlns:wps="http://schemas.microsoft.com/office/word/2010/wordprocessingShape" mc:Ignorable="w14 w15 w16se w16cid w16 w16cex w16sdtdh w16sdtfl w16du wp14">
+  <w:comment w:id="0" w:author="Rollo Tully" w:date="2025-01-30T15:12:00Z" w:initials="RT">
+    <w:p>
+      <w:pPr>
+        <w:pStyle w:val="CommentText"/>
+      </w:pPr>
+      <w:r>
+        <w:rPr>
+          <w:rStyle w:val="CommentReference"/>
+        </w:rPr>
+        <w:annotationRef/>
+      </w:r>
+      <w:r>
+        <w:t>Changed to derivative free method</w:t>
+      </w:r>
+    </w:p>
+  </w:comment>
+</w:comments>
+</file>
+
+<file path=word/commentsExtended.xml><?xml version="1.0" encoding="utf-8"?>
+<w15:commentsEx xmlns:wpc="http://schemas.microsoft.com/office/word/2010/wordprocessingCanvas" xmlns:cx="http://schemas.microsoft.com/office/drawing/2014/chartex" xmlns:cx1="http://schemas.microsoft.com/office/drawing/2015/9/8/chartex" xmlns:cx2="http://schemas.microsoft.com/office/drawing/2015/10/21/chartex" xmlns:cx3="http://schemas.microsoft.com/office/drawing/2016/5/9/chartex" xmlns:cx4="http://schemas.microsoft.com/office/drawing/2016/5/10/chartex" xmlns:cx5="http://schemas.microsoft.com/office/drawing/2016/5/11/chartex" xmlns:cx6="http://schemas.microsoft.com/office/drawing/2016/5/12/chartex" xmlns:cx7="http://schemas.microsoft.com/office/drawing/2016/5/13/chartex" xmlns:cx8="http://schemas.microsoft.com/office/drawing/2016/5/14/chartex" xmlns:mc="http://schemas.openxmlformats.org/markup-compatibility/2006" xmlns:aink="http://schemas.microsoft.com/office/drawing/2016/ink" xmlns:am3d="http://schemas.microsoft.com/office/drawing/2017/model3d" xmlns:o="urn:schemas-microsoft-com:office:office" xmlns:oel="http://schemas.microsoft.com/office/2019/extlst" xmlns:r="http://schemas.openxmlformats.org/officeDocument/2006/relationships" xmlns:m="http://schemas.openxmlformats.org/officeDocument/2006/math" xmlns:v="urn:schemas-microsoft-com:vml" xmlns:wp14="http://schemas.microsoft.com/office/word/2010/wordprocessingDrawing" xmlns:wp="http://schemas.openxmlformats.org/drawingml/2006/wordprocessingDrawing" xmlns:w10="urn:schemas-microsoft-com:office:word" xmlns:w="http://schemas.openxmlformats.org/wordprocessingml/2006/main" xmlns:w14="http://schemas.microsoft.com/office/word/2010/wordml" xmlns:w15="http://schemas.microsoft.com/office/word/2012/wordml" xmlns:w16cex="http://schemas.microsoft.com/office/word/2018/wordml/cex" xmlns:w16cid="http://schemas.microsoft.com/office/word/2016/wordml/cid" xmlns:w16="http://schemas.microsoft.com/office/word/2018/wordml" xmlns:w16du="http://schemas.microsoft.com/office/word/2023/wordml/word16du" xmlns:w16sdtdh="http://schemas.microsoft.com/office/word/2020/wordml/sdtdatahash" xmlns:w16sdtfl="http://schemas.microsoft.com/office/word/2024/wordml/sdtformatlock" xmlns:w16se="http://schemas.microsoft.com/office/word/2015/wordml/symex" xmlns:wpg="http://schemas.microsoft.com/office/word/2010/wordprocessingGroup" xmlns:wpi="http://schemas.microsoft.com/office/word/2010/wordprocessingInk" xmlns:wne="http://schemas.microsoft.com/office/word/2006/wordml" xmlns:wps="http://schemas.microsoft.com/office/word/2010/wordprocessingShape" mc:Ignorable="w14 w15 w16se w16cid w16 w16cex w16sdtdh w16sdtfl w16du wp14">
+  <w15:commentEx w15:paraId="0F9CE068" w15:done="0"/>
+</w15:commentsEx>
+</file>
+
+<file path=word/commentsExtensible.xml><?xml version="1.0" encoding="utf-8"?>
+<w16cex:commentsExtensible xmlns:wpc="http://schemas.microsoft.com/office/word/2010/wordprocessingCanvas" xmlns:cx="http://schemas.microsoft.com/office/drawing/2014/chartex" xmlns:cx1="http://schemas.microsoft.com/office/drawing/2015/9/8/chartex" xmlns:cx2="http://schemas.microsoft.com/office/drawing/2015/10/21/chartex" xmlns:cx3="http://schemas.microsoft.com/office/drawing/2016/5/9/chartex" xmlns:cx4="http://schemas.microsoft.com/office/drawing/2016/5/10/chartex" xmlns:cx5="http://schemas.microsoft.com/office/drawing/2016/5/11/chartex" xmlns:cx6="http://schemas.microsoft.com/office/drawing/2016/5/12/chartex" xmlns:cx7="http://schemas.microsoft.com/office/drawing/2016/5/13/chartex" xmlns:cx8="http://schemas.microsoft.com/office/drawing/2016/5/14/chartex" xmlns:cr="http://schemas.microsoft.com/office/comments/2020/reactions" xmlns:mc="http://schemas.openxmlformats.org/markup-compatibility/2006" xmlns:aink="http://schemas.microsoft.com/office/drawing/2016/ink" xmlns:am3d="http://schemas.microsoft.com/office/drawing/2017/model3d" xmlns:o="urn:schemas-microsoft-com:office:office" xmlns:oel="http://schemas.microsoft.com/office/2019/extlst" xmlns:r="http://schemas.openxmlformats.org/officeDocument/2006/relationships" xmlns:m="http://schemas.openxmlformats.org/officeDocument/2006/math" xmlns:v="urn:schemas-microsoft-com:vml" xmlns:wp14="http://schemas.microsoft.com/office/word/2010/wordprocessingDrawing" xmlns:wp="http://schemas.openxmlformats.org/drawingml/2006/wordprocessingDrawing" xmlns:w10="urn:schemas-microsoft-com:office:word" xmlns:w="http://schemas.openxmlformats.org/wordprocessingml/2006/main" xmlns:w14="http://schemas.microsoft.com/office/word/2010/wordml" xmlns:w15="http://schemas.microsoft.com/office/word/2012/wordml" xmlns:w16cex="http://schemas.microsoft.com/office/word/2018/wordml/cex" xmlns:w16cid="http://schemas.microsoft.com/office/word/2016/wordml/cid" xmlns:w16="http://schemas.microsoft.com/office/word/2018/wordml" xmlns:w16du="http://schemas.microsoft.com/office/word/2023/wordml/word16du" xmlns:w16sdtdh="http://schemas.microsoft.com/office/word/2020/wordml/sdtdatahash" xmlns:w16sdtfl="http://schemas.microsoft.com/office/word/2024/wordml/sdtformatlock" xmlns:w16se="http://schemas.microsoft.com/office/word/2015/wordml/symex" xmlns:wpg="http://schemas.microsoft.com/office/word/2010/wordprocessingGroup" xmlns:wpi="http://schemas.microsoft.com/office/word/2010/wordprocessingInk" xmlns:wne="http://schemas.microsoft.com/office/word/2006/wordml" xmlns:wps="http://schemas.microsoft.com/office/word/2010/wordprocessingShape" mc:Ignorable="w14 w15 w16se w16cid w16 w16cex w16sdtdh w16sdtfl cr w16du wp14">
+  <w16cex:commentExtensible w16cex:durableId="615FA491" w16cex:dateUtc="2025-01-30T15:12:00Z"/>
+</w16cex:commentsExtensible>
+</file>
+
+<file path=word/commentsIds.xml><?xml version="1.0" encoding="utf-8"?>
+<w16cid:commentsIds xmlns:wpc="http://schemas.microsoft.com/office/word/2010/wordprocessingCanvas" xmlns:cx="http://schemas.microsoft.com/office/drawing/2014/chartex" xmlns:cx1="http://schemas.microsoft.com/office/drawing/2015/9/8/chartex" xmlns:cx2="http://schemas.microsoft.com/office/drawing/2015/10/21/chartex" xmlns:cx3="http://schemas.microsoft.com/office/drawing/2016/5/9/chartex" xmlns:cx4="http://schemas.microsoft.com/office/drawing/2016/5/10/chartex" xmlns:cx5="http://schemas.microsoft.com/office/drawing/2016/5/11/chartex" xmlns:cx6="http://schemas.microsoft.com/office/drawing/2016/5/12/chartex" xmlns:cx7="http://schemas.microsoft.com/office/drawing/2016/5/13/chartex" xmlns:cx8="http://schemas.microsoft.com/office/drawing/2016/5/14/chartex" xmlns:mc="http://schemas.openxmlformats.org/markup-compatibility/2006" xmlns:aink="http://schemas.microsoft.com/office/drawing/2016/ink" xmlns:am3d="http://schemas.microsoft.com/office/drawing/2017/model3d" xmlns:o="urn:schemas-microsoft-com:office:office" xmlns:oel="http://schemas.microsoft.com/office/2019/extlst" xmlns:r="http://schemas.openxmlformats.org/officeDocument/2006/relationships" xmlns:m="http://schemas.openxmlformats.org/officeDocument/2006/math" xmlns:v="urn:schemas-microsoft-com:vml" xmlns:wp14="http://schemas.microsoft.com/office/word/2010/wordprocessingDrawing" xmlns:wp="http://schemas.openxmlformats.org/drawingml/2006/wordprocessingDrawing" xmlns:w10="urn:schemas-microsoft-com:office:word" xmlns:w="http://schemas.openxmlformats.org/wordprocessingml/2006/main" xmlns:w14="http://schemas.microsoft.com/office/word/2010/wordml" xmlns:w15="http://schemas.microsoft.com/office/word/2012/wordml" xmlns:w16cex="http://schemas.microsoft.com/office/word/2018/wordml/cex" xmlns:w16cid="http://schemas.microsoft.com/office/word/2016/wordml/cid" xmlns:w16="http://schemas.microsoft.com/office/word/2018/wordml" xmlns:w16du="http://schemas.microsoft.com/office/word/2023/wordml/word16du" xmlns:w16sdtdh="http://schemas.microsoft.com/office/word/2020/wordml/sdtdatahash" xmlns:w16sdtfl="http://schemas.microsoft.com/office/word/2024/wordml/sdtformatlock" xmlns:w16se="http://schemas.microsoft.com/office/word/2015/wordml/symex" xmlns:wpg="http://schemas.microsoft.com/office/word/2010/wordprocessingGroup" xmlns:wpi="http://schemas.microsoft.com/office/word/2010/wordprocessingInk" xmlns:wne="http://schemas.microsoft.com/office/word/2006/wordml" xmlns:wps="http://schemas.microsoft.com/office/word/2010/wordprocessingShape" mc:Ignorable="w14 w15 w16se w16cid w16 w16cex w16sdtdh w16sdtfl w16du wp14">
+  <w16cid:commentId w16cid:paraId="0F9CE068" w16cid:durableId="615FA491"/>
+</w16cid:commentsIds>
+</file>
+
 <file path=word/endnotes.xml><?xml version="1.0" encoding="utf-8"?>
-<w:endnotes xmlns:wpc="http://schemas.microsoft.com/office/word/2010/wordprocessingCanvas" xmlns:cx="http://schemas.microsoft.com/office/drawing/2014/chartex" xmlns:cx1="http://schemas.microsoft.com/office/drawing/2015/9/8/chartex" xmlns:cx2="http://schemas.microsoft.com/office/drawing/2015/10/21/chartex" xmlns:cx3="http://schemas.microsoft.com/office/drawing/2016/5/9/chartex" xmlns:cx4="http://schemas.microsoft.com/office/drawing/2016/5/10/chartex" xmlns:cx5="http://schemas.microsoft.com/office/drawing/2016/5/11/chartex" xmlns:cx6="http://schemas.microsoft.com/office/drawing/2016/5/12/chartex" xmlns:cx7="http://schemas.microsoft.com/office/drawing/2016/5/13/chartex" xmlns:cx8="http://schemas.microsoft.com/office/drawing/2016/5/14/chartex" xmlns:mc="http://schemas.openxmlformats.org/markup-compatibility/2006" xmlns:aink="http://schemas.microsoft.com/office/drawing/2016/ink" xmlns:am3d="http://schemas.microsoft.com/office/drawing/2017/model3d" xmlns:o="urn:schemas-microsoft-com:office:office" xmlns:oel="http://schemas.microsoft.com/office/2019/extlst" xmlns:r="http://schemas.openxmlformats.org/officeDocument/2006/relationships" xmlns:m="http://schemas.openxmlformats.org/officeDocument/2006/math" xmlns:v="urn:schemas-microsoft-com:vml" xmlns:wp14="http://schemas.microsoft.com/office/word/2010/wordprocessingDrawing" xmlns:wp="http://schemas.openxmlformats.org/drawingml/2006/wordprocessingDrawing" xmlns:w10="urn:schemas-microsoft-com:office:word" xmlns:w="http://schemas.openxmlformats.org/wordprocessingml/2006/main" xmlns:w14="http://schemas.microsoft.com/office/word/2010/wordml" xmlns:w15="http://schemas.microsoft.com/office/word/2012/wordml" xmlns:w16cex="http://schemas.microsoft.com/office/word/2018/wordml/cex" xmlns:w16cid="http://schemas.microsoft.com/office/word/2016/wordml/cid" xmlns:w16="http://schemas.microsoft.com/office/word/2018/wordml" xmlns:w16du="http://schemas.microsoft.com/office/word/2023/wordml/word16du" xmlns:w16sdtdh="http://schemas.microsoft.com/office/word/2020/wordml/sdtdatahash" xmlns:w16se="http://schemas.microsoft.com/office/word/2015/wordml/symex" xmlns:wpg="http://schemas.microsoft.com/office/word/2010/wordprocessingGroup" xmlns:wpi="http://schemas.microsoft.com/office/word/2010/wordprocessingInk" xmlns:wne="http://schemas.microsoft.com/office/word/2006/wordml" xmlns:wps="http://schemas.microsoft.com/office/word/2010/wordprocessingShape" mc:Ignorable="w14 w15 w16se w16cid w16 w16cex w16sdtdh w16du wp14">
+<w:endnotes xmlns:wpc="http://schemas.microsoft.com/office/word/2010/wordprocessingCanvas" xmlns:cx="http://schemas.microsoft.com/office/drawing/2014/chartex" xmlns:cx1="http://schemas.microsoft.com/office/drawing/2015/9/8/chartex" xmlns:cx2="http://schemas.microsoft.com/office/drawing/2015/10/21/chartex" xmlns:cx3="http://schemas.microsoft.com/office/drawing/2016/5/9/chartex" xmlns:cx4="http://schemas.microsoft.com/office/drawing/2016/5/10/chartex" xmlns:cx5="http://schemas.microsoft.com/office/drawing/2016/5/11/chartex" xmlns:cx6="http://schemas.microsoft.com/office/drawing/2016/5/12/chartex" xmlns:cx7="http://schemas.microsoft.com/office/drawing/2016/5/13/chartex" xmlns:cx8="http://schemas.microsoft.com/office/drawing/2016/5/14/chartex" xmlns:mc="http://schemas.openxmlformats.org/markup-compatibility/2006" xmlns:aink="http://schemas.microsoft.com/office/drawing/2016/ink" xmlns:am3d="http://schemas.microsoft.com/office/drawing/2017/model3d" xmlns:o="urn:schemas-microsoft-com:office:office" xmlns:oel="http://schemas.microsoft.com/office/2019/extlst" xmlns:r="http://schemas.openxmlformats.org/officeDocument/2006/relationships" xmlns:m="http://schemas.openxmlformats.org/officeDocument/2006/math" xmlns:v="urn:schemas-microsoft-com:vml" xmlns:wp14="http://schemas.microsoft.com/office/word/2010/wordprocessingDrawing" xmlns:wp="http://schemas.openxmlformats.org/drawingml/2006/wordprocessingDrawing" xmlns:w10="urn:schemas-microsoft-com:office:word" xmlns:w="http://schemas.openxmlformats.org/wordprocessingml/2006/main" xmlns:w14="http://schemas.microsoft.com/office/word/2010/wordml" xmlns:w15="http://schemas.microsoft.com/office/word/2012/wordml" xmlns:w16cex="http://schemas.microsoft.com/office/word/2018/wordml/cex" xmlns:w16cid="http://schemas.microsoft.com/office/word/2016/wordml/cid" xmlns:w16="http://schemas.microsoft.com/office/word/2018/wordml" xmlns:w16du="http://schemas.microsoft.com/office/word/2023/wordml/word16du" xmlns:w16sdtdh="http://schemas.microsoft.com/office/word/2020/wordml/sdtdatahash" xmlns:w16sdtfl="http://schemas.microsoft.com/office/word/2024/wordml/sdtformatlock" xmlns:w16se="http://schemas.microsoft.com/office/word/2015/wordml/symex" xmlns:wpg="http://schemas.microsoft.com/office/word/2010/wordprocessingGroup" xmlns:wpi="http://schemas.microsoft.com/office/word/2010/wordprocessingInk" xmlns:wne="http://schemas.microsoft.com/office/word/2006/wordml" xmlns:wps="http://schemas.microsoft.com/office/word/2010/wordprocessingShape" mc:Ignorable="w14 w15 w16se w16cid w16 w16cex w16sdtdh w16sdtfl w16du wp14">
   <w:endnote w:type="separator" w:id="-1">
     <w:p>
       <w:r>
@@ -3073,7 +3112,7 @@
 </file>
 
 <file path=word/footnotes.xml><?xml version="1.0" encoding="utf-8"?>
-<w:footnotes xmlns:wpc="http://schemas.microsoft.com/office/word/2010/wordprocessingCanvas" xmlns:cx="http://schemas.microsoft.com/office/drawing/2014/chartex" xmlns:cx1="http://schemas.microsoft.com/office/drawing/2015/9/8/chartex" xmlns:cx2="http://schemas.microsoft.com/office/drawing/2015/10/21/chartex" xmlns:cx3="http://schemas.microsoft.com/office/drawing/2016/5/9/chartex" xmlns:cx4="http://schemas.microsoft.com/office/drawing/2016/5/10/chartex" xmlns:cx5="http://schemas.microsoft.com/office/drawing/2016/5/11/chartex" xmlns:cx6="http://schemas.microsoft.com/office/drawing/2016/5/12/chartex" xmlns:cx7="http://schemas.microsoft.com/office/drawing/2016/5/13/chartex" xmlns:cx8="http://schemas.microsoft.com/office/drawing/2016/5/14/chartex" xmlns:mc="http://schemas.openxmlformats.org/markup-compatibility/2006" xmlns:aink="http://schemas.microsoft.com/office/drawing/2016/ink" xmlns:am3d="http://schemas.microsoft.com/office/drawing/2017/model3d" xmlns:o="urn:schemas-microsoft-com:office:office" xmlns:oel="http://schemas.microsoft.com/office/2019/extlst" xmlns:r="http://schemas.openxmlformats.org/officeDocument/2006/relationships" xmlns:m="http://schemas.openxmlformats.org/officeDocument/2006/math" xmlns:v="urn:schemas-microsoft-com:vml" xmlns:wp14="http://schemas.microsoft.com/office/word/2010/wordprocessingDrawing" xmlns:wp="http://schemas.openxmlformats.org/drawingml/2006/wordprocessingDrawing" xmlns:w10="urn:schemas-microsoft-com:office:word" xmlns:w="http://schemas.openxmlformats.org/wordprocessingml/2006/main" xmlns:w14="http://schemas.microsoft.com/office/word/2010/wordml" xmlns:w15="http://schemas.microsoft.com/office/word/2012/wordml" xmlns:w16cex="http://schemas.microsoft.com/office/word/2018/wordml/cex" xmlns:w16cid="http://schemas.microsoft.com/office/word/2016/wordml/cid" xmlns:w16="http://schemas.microsoft.com/office/word/2018/wordml" xmlns:w16du="http://schemas.microsoft.com/office/word/2023/wordml/word16du" xmlns:w16sdtdh="http://schemas.microsoft.com/office/word/2020/wordml/sdtdatahash" xmlns:w16se="http://schemas.microsoft.com/office/word/2015/wordml/symex" xmlns:wpg="http://schemas.microsoft.com/office/word/2010/wordprocessingGroup" xmlns:wpi="http://schemas.microsoft.com/office/word/2010/wordprocessingInk" xmlns:wne="http://schemas.microsoft.com/office/word/2006/wordml" xmlns:wps="http://schemas.microsoft.com/office/word/2010/wordprocessingShape" mc:Ignorable="w14 w15 w16se w16cid w16 w16cex w16sdtdh w16du wp14">
+<w:footnotes xmlns:wpc="http://schemas.microsoft.com/office/word/2010/wordprocessingCanvas" xmlns:cx="http://schemas.microsoft.com/office/drawing/2014/chartex" xmlns:cx1="http://schemas.microsoft.com/office/drawing/2015/9/8/chartex" xmlns:cx2="http://schemas.microsoft.com/office/drawing/2015/10/21/chartex" xmlns:cx3="http://schemas.microsoft.com/office/drawing/2016/5/9/chartex" xmlns:cx4="http://schemas.microsoft.com/office/drawing/2016/5/10/chartex" xmlns:cx5="http://schemas.microsoft.com/office/drawing/2016/5/11/chartex" xmlns:cx6="http://schemas.microsoft.com/office/drawing/2016/5/12/chartex" xmlns:cx7="http://schemas.microsoft.com/office/drawing/2016/5/13/chartex" xmlns:cx8="http://schemas.microsoft.com/office/drawing/2016/5/14/chartex" xmlns:mc="http://schemas.openxmlformats.org/markup-compatibility/2006" xmlns:aink="http://schemas.microsoft.com/office/drawing/2016/ink" xmlns:am3d="http://schemas.microsoft.com/office/drawing/2017/model3d" xmlns:o="urn:schemas-microsoft-com:office:office" xmlns:oel="http://schemas.microsoft.com/office/2019/extlst" xmlns:r="http://schemas.openxmlformats.org/officeDocument/2006/relationships" xmlns:m="http://schemas.openxmlformats.org/officeDocument/2006/math" xmlns:v="urn:schemas-microsoft-com:vml" xmlns:wp14="http://schemas.microsoft.com/office/word/2010/wordprocessingDrawing" xmlns:wp="http://schemas.openxmlformats.org/drawingml/2006/wordprocessingDrawing" xmlns:w10="urn:schemas-microsoft-com:office:word" xmlns:w="http://schemas.openxmlformats.org/wordprocessingml/2006/main" xmlns:w14="http://schemas.microsoft.com/office/word/2010/wordml" xmlns:w15="http://schemas.microsoft.com/office/word/2012/wordml" xmlns:w16cex="http://schemas.microsoft.com/office/word/2018/wordml/cex" xmlns:w16cid="http://schemas.microsoft.com/office/word/2016/wordml/cid" xmlns:w16="http://schemas.microsoft.com/office/word/2018/wordml" xmlns:w16du="http://schemas.microsoft.com/office/word/2023/wordml/word16du" xmlns:w16sdtdh="http://schemas.microsoft.com/office/word/2020/wordml/sdtdatahash" xmlns:w16sdtfl="http://schemas.microsoft.com/office/word/2024/wordml/sdtformatlock" xmlns:w16se="http://schemas.microsoft.com/office/word/2015/wordml/symex" xmlns:wpg="http://schemas.microsoft.com/office/word/2010/wordprocessingGroup" xmlns:wpi="http://schemas.microsoft.com/office/word/2010/wordprocessingInk" xmlns:wne="http://schemas.microsoft.com/office/word/2006/wordml" xmlns:wps="http://schemas.microsoft.com/office/word/2010/wordprocessingShape" mc:Ignorable="w14 w15 w16se w16cid w16 w16cex w16sdtdh w16sdtfl w16du wp14">
   <w:footnote w:type="separator" w:id="-1">
     <w:p/>
   </w:footnote>
@@ -3095,7 +3134,7 @@
 </file>
 
 <file path=word/header1.xml><?xml version="1.0" encoding="utf-8"?>
-<w:hdr xmlns:wpc="http://schemas.microsoft.com/office/word/2010/wordprocessingCanvas" xmlns:cx="http://schemas.microsoft.com/office/drawing/2014/chartex" xmlns:cx1="http://schemas.microsoft.com/office/drawing/2015/9/8/chartex" xmlns:cx2="http://schemas.microsoft.com/office/drawing/2015/10/21/chartex" xmlns:cx3="http://schemas.microsoft.com/office/drawing/2016/5/9/chartex" xmlns:cx4="http://schemas.microsoft.com/office/drawing/2016/5/10/chartex" xmlns:cx5="http://schemas.microsoft.com/office/drawing/2016/5/11/chartex" xmlns:cx6="http://schemas.microsoft.com/office/drawing/2016/5/12/chartex" xmlns:cx7="http://schemas.microsoft.com/office/drawing/2016/5/13/chartex" xmlns:cx8="http://schemas.microsoft.com/office/drawing/2016/5/14/chartex" xmlns:mc="http://schemas.openxmlformats.org/markup-compatibility/2006" xmlns:aink="http://schemas.microsoft.com/office/drawing/2016/ink" xmlns:am3d="http://schemas.microsoft.com/office/drawing/2017/model3d" xmlns:o="urn:schemas-microsoft-com:office:office" xmlns:oel="http://schemas.microsoft.com/office/2019/extlst" xmlns:r="http://schemas.openxmlformats.org/officeDocument/2006/relationships" xmlns:m="http://schemas.openxmlformats.org/officeDocument/2006/math" xmlns:v="urn:schemas-microsoft-com:vml" xmlns:wp14="http://schemas.microsoft.com/office/word/2010/wordprocessingDrawing" xmlns:wp="http://schemas.openxmlformats.org/drawingml/2006/wordprocessingDrawing" xmlns:w10="urn:schemas-microsoft-com:office:word" xmlns:w="http://schemas.openxmlformats.org/wordprocessingml/2006/main" xmlns:w14="http://schemas.microsoft.com/office/word/2010/wordml" xmlns:w15="http://schemas.microsoft.com/office/word/2012/wordml" xmlns:w16cex="http://schemas.microsoft.com/office/word/2018/wordml/cex" xmlns:w16cid="http://schemas.microsoft.com/office/word/2016/wordml/cid" xmlns:w16="http://schemas.microsoft.com/office/word/2018/wordml" xmlns:w16du="http://schemas.microsoft.com/office/word/2023/wordml/word16du" xmlns:w16sdtdh="http://schemas.microsoft.com/office/word/2020/wordml/sdtdatahash" xmlns:w16se="http://schemas.microsoft.com/office/word/2015/wordml/symex" xmlns:wpg="http://schemas.microsoft.com/office/word/2010/wordprocessingGroup" xmlns:wpi="http://schemas.microsoft.com/office/word/2010/wordprocessingInk" xmlns:wne="http://schemas.microsoft.com/office/word/2006/wordml" xmlns:wps="http://schemas.microsoft.com/office/word/2010/wordprocessingShape" mc:Ignorable="w14 w15 w16se w16cid w16 w16cex w16sdtdh w16du wp14">
+<w:hdr xmlns:wpc="http://schemas.microsoft.com/office/word/2010/wordprocessingCanvas" xmlns:cx="http://schemas.microsoft.com/office/drawing/2014/chartex" xmlns:cx1="http://schemas.microsoft.com/office/drawing/2015/9/8/chartex" xmlns:cx2="http://schemas.microsoft.com/office/drawing/2015/10/21/chartex" xmlns:cx3="http://schemas.microsoft.com/office/drawing/2016/5/9/chartex" xmlns:cx4="http://schemas.microsoft.com/office/drawing/2016/5/10/chartex" xmlns:cx5="http://schemas.microsoft.com/office/drawing/2016/5/11/chartex" xmlns:cx6="http://schemas.microsoft.com/office/drawing/2016/5/12/chartex" xmlns:cx7="http://schemas.microsoft.com/office/drawing/2016/5/13/chartex" xmlns:cx8="http://schemas.microsoft.com/office/drawing/2016/5/14/chartex" xmlns:mc="http://schemas.openxmlformats.org/markup-compatibility/2006" xmlns:aink="http://schemas.microsoft.com/office/drawing/2016/ink" xmlns:am3d="http://schemas.microsoft.com/office/drawing/2017/model3d" xmlns:o="urn:schemas-microsoft-com:office:office" xmlns:oel="http://schemas.microsoft.com/office/2019/extlst" xmlns:r="http://schemas.openxmlformats.org/officeDocument/2006/relationships" xmlns:m="http://schemas.openxmlformats.org/officeDocument/2006/math" xmlns:v="urn:schemas-microsoft-com:vml" xmlns:wp14="http://schemas.microsoft.com/office/word/2010/wordprocessingDrawing" xmlns:wp="http://schemas.openxmlformats.org/drawingml/2006/wordprocessingDrawing" xmlns:w10="urn:schemas-microsoft-com:office:word" xmlns:w="http://schemas.openxmlformats.org/wordprocessingml/2006/main" xmlns:w14="http://schemas.microsoft.com/office/word/2010/wordml" xmlns:w15="http://schemas.microsoft.com/office/word/2012/wordml" xmlns:w16cex="http://schemas.microsoft.com/office/word/2018/wordml/cex" xmlns:w16cid="http://schemas.microsoft.com/office/word/2016/wordml/cid" xmlns:w16="http://schemas.microsoft.com/office/word/2018/wordml" xmlns:w16du="http://schemas.microsoft.com/office/word/2023/wordml/word16du" xmlns:w16sdtdh="http://schemas.microsoft.com/office/word/2020/wordml/sdtdatahash" xmlns:w16sdtfl="http://schemas.microsoft.com/office/word/2024/wordml/sdtformatlock" xmlns:w16se="http://schemas.microsoft.com/office/word/2015/wordml/symex" xmlns:wpg="http://schemas.microsoft.com/office/word/2010/wordprocessingGroup" xmlns:wpi="http://schemas.microsoft.com/office/word/2010/wordprocessingInk" xmlns:wne="http://schemas.microsoft.com/office/word/2006/wordml" xmlns:wps="http://schemas.microsoft.com/office/word/2010/wordprocessingShape" mc:Ignorable="w14 w15 w16se w16cid w16 w16cex w16sdtdh w16sdtfl w16du wp14">
   <w:p>
     <w:pPr>
       <w:framePr w:wrap="auto" w:vAnchor="text" w:hAnchor="margin" w:xAlign="right" w:y="1"/>
@@ -3110,7 +3149,7 @@
 </file>
 
 <file path=word/numbering.xml><?xml version="1.0" encoding="utf-8"?>
-<w:numbering xmlns:wpc="http://schemas.microsoft.com/office/word/2010/wordprocessingCanvas" xmlns:cx="http://schemas.microsoft.com/office/drawing/2014/chartex" xmlns:cx1="http://schemas.microsoft.com/office/drawing/2015/9/8/chartex" xmlns:cx2="http://schemas.microsoft.com/office/drawing/2015/10/21/chartex" xmlns:cx3="http://schemas.microsoft.com/office/drawing/2016/5/9/chartex" xmlns:cx4="http://schemas.microsoft.com/office/drawing/2016/5/10/chartex" xmlns:cx5="http://schemas.microsoft.com/office/drawing/2016/5/11/chartex" xmlns:cx6="http://schemas.microsoft.com/office/drawing/2016/5/12/chartex" xmlns:cx7="http://schemas.microsoft.com/office/drawing/2016/5/13/chartex" xmlns:cx8="http://schemas.microsoft.com/office/drawing/2016/5/14/chartex" xmlns:mc="http://schemas.openxmlformats.org/markup-compatibility/2006" xmlns:aink="http://schemas.microsoft.com/office/drawing/2016/ink" xmlns:am3d="http://schemas.microsoft.com/office/drawing/2017/model3d" xmlns:o="urn:schemas-microsoft-com:office:office" xmlns:oel="http://schemas.microsoft.com/office/2019/extlst" xmlns:r="http://schemas.openxmlformats.org/officeDocument/2006/relationships" xmlns:m="http://schemas.openxmlformats.org/officeDocument/2006/math" xmlns:v="urn:schemas-microsoft-com:vml" xmlns:wp14="http://schemas.microsoft.com/office/word/2010/wordprocessingDrawing" xmlns:wp="http://schemas.openxmlformats.org/drawingml/2006/wordprocessingDrawing" xmlns:w10="urn:schemas-microsoft-com:office:word" xmlns:w="http://schemas.openxmlformats.org/wordprocessingml/2006/main" xmlns:w14="http://schemas.microsoft.com/office/word/2010/wordml" xmlns:w15="http://schemas.microsoft.com/office/word/2012/wordml" xmlns:w16cex="http://schemas.microsoft.com/office/word/2018/wordml/cex" xmlns:w16cid="http://schemas.microsoft.com/office/word/2016/wordml/cid" xmlns:w16="http://schemas.microsoft.com/office/word/2018/wordml" xmlns:w16du="http://schemas.microsoft.com/office/word/2023/wordml/word16du" xmlns:w16sdtdh="http://schemas.microsoft.com/office/word/2020/wordml/sdtdatahash" xmlns:w16se="http://schemas.microsoft.com/office/word/2015/wordml/symex" xmlns:wpg="http://schemas.microsoft.com/office/word/2010/wordprocessingGroup" xmlns:wpi="http://schemas.microsoft.com/office/word/2010/wordprocessingInk" xmlns:wne="http://schemas.microsoft.com/office/word/2006/wordml" xmlns:wps="http://schemas.microsoft.com/office/word/2010/wordprocessingShape" mc:Ignorable="w14 w15 w16se w16cid w16 w16cex w16sdtdh w16du wp14">
+<w:numbering xmlns:wpc="http://schemas.microsoft.com/office/word/2010/wordprocessingCanvas" xmlns:cx="http://schemas.microsoft.com/office/drawing/2014/chartex" xmlns:cx1="http://schemas.microsoft.com/office/drawing/2015/9/8/chartex" xmlns:cx2="http://schemas.microsoft.com/office/drawing/2015/10/21/chartex" xmlns:cx3="http://schemas.microsoft.com/office/drawing/2016/5/9/chartex" xmlns:cx4="http://schemas.microsoft.com/office/drawing/2016/5/10/chartex" xmlns:cx5="http://schemas.microsoft.com/office/drawing/2016/5/11/chartex" xmlns:cx6="http://schemas.microsoft.com/office/drawing/2016/5/12/chartex" xmlns:cx7="http://schemas.microsoft.com/office/drawing/2016/5/13/chartex" xmlns:cx8="http://schemas.microsoft.com/office/drawing/2016/5/14/chartex" xmlns:mc="http://schemas.openxmlformats.org/markup-compatibility/2006" xmlns:aink="http://schemas.microsoft.com/office/drawing/2016/ink" xmlns:am3d="http://schemas.microsoft.com/office/drawing/2017/model3d" xmlns:o="urn:schemas-microsoft-com:office:office" xmlns:oel="http://schemas.microsoft.com/office/2019/extlst" xmlns:r="http://schemas.openxmlformats.org/officeDocument/2006/relationships" xmlns:m="http://schemas.openxmlformats.org/officeDocument/2006/math" xmlns:v="urn:schemas-microsoft-com:vml" xmlns:wp14="http://schemas.microsoft.com/office/word/2010/wordprocessingDrawing" xmlns:wp="http://schemas.openxmlformats.org/drawingml/2006/wordprocessingDrawing" xmlns:w10="urn:schemas-microsoft-com:office:word" xmlns:w="http://schemas.openxmlformats.org/wordprocessingml/2006/main" xmlns:w14="http://schemas.microsoft.com/office/word/2010/wordml" xmlns:w15="http://schemas.microsoft.com/office/word/2012/wordml" xmlns:w16cex="http://schemas.microsoft.com/office/word/2018/wordml/cex" xmlns:w16cid="http://schemas.microsoft.com/office/word/2016/wordml/cid" xmlns:w16="http://schemas.microsoft.com/office/word/2018/wordml" xmlns:w16du="http://schemas.microsoft.com/office/word/2023/wordml/word16du" xmlns:w16sdtdh="http://schemas.microsoft.com/office/word/2020/wordml/sdtdatahash" xmlns:w16sdtfl="http://schemas.microsoft.com/office/word/2024/wordml/sdtformatlock" xmlns:w16se="http://schemas.microsoft.com/office/word/2015/wordml/symex" xmlns:wpg="http://schemas.microsoft.com/office/word/2010/wordprocessingGroup" xmlns:wpi="http://schemas.microsoft.com/office/word/2010/wordprocessingInk" xmlns:wne="http://schemas.microsoft.com/office/word/2006/wordml" xmlns:wps="http://schemas.microsoft.com/office/word/2010/wordprocessingShape" mc:Ignorable="w14 w15 w16se w16cid w16 w16cex w16sdtdh w16sdtfl w16du wp14">
   <w:abstractNum w:abstractNumId="0" w15:restartNumberingAfterBreak="0">
     <w:nsid w:val="FFFFFFFB"/>
     <w:multiLevelType w:val="multilevel"/>
@@ -3960,8 +3999,16 @@
 </w:numbering>
 </file>
 
+<file path=word/people.xml><?xml version="1.0" encoding="utf-8"?>
+<w15:people xmlns:wpc="http://schemas.microsoft.com/office/word/2010/wordprocessingCanvas" xmlns:cx="http://schemas.microsoft.com/office/drawing/2014/chartex" xmlns:cx1="http://schemas.microsoft.com/office/drawing/2015/9/8/chartex" xmlns:cx2="http://schemas.microsoft.com/office/drawing/2015/10/21/chartex" xmlns:cx3="http://schemas.microsoft.com/office/drawing/2016/5/9/chartex" xmlns:cx4="http://schemas.microsoft.com/office/drawing/2016/5/10/chartex" xmlns:cx5="http://schemas.microsoft.com/office/drawing/2016/5/11/chartex" xmlns:cx6="http://schemas.microsoft.com/office/drawing/2016/5/12/chartex" xmlns:cx7="http://schemas.microsoft.com/office/drawing/2016/5/13/chartex" xmlns:cx8="http://schemas.microsoft.com/office/drawing/2016/5/14/chartex" xmlns:mc="http://schemas.openxmlformats.org/markup-compatibility/2006" xmlns:aink="http://schemas.microsoft.com/office/drawing/2016/ink" xmlns:am3d="http://schemas.microsoft.com/office/drawing/2017/model3d" xmlns:o="urn:schemas-microsoft-com:office:office" xmlns:oel="http://schemas.microsoft.com/office/2019/extlst" xmlns:r="http://schemas.openxmlformats.org/officeDocument/2006/relationships" xmlns:m="http://schemas.openxmlformats.org/officeDocument/2006/math" xmlns:v="urn:schemas-microsoft-com:vml" xmlns:wp14="http://schemas.microsoft.com/office/word/2010/wordprocessingDrawing" xmlns:wp="http://schemas.openxmlformats.org/drawingml/2006/wordprocessingDrawing" xmlns:w10="urn:schemas-microsoft-com:office:word" xmlns:w="http://schemas.openxmlformats.org/wordprocessingml/2006/main" xmlns:w14="http://schemas.microsoft.com/office/word/2010/wordml" xmlns:w15="http://schemas.microsoft.com/office/word/2012/wordml" xmlns:w16cex="http://schemas.microsoft.com/office/word/2018/wordml/cex" xmlns:w16cid="http://schemas.microsoft.com/office/word/2016/wordml/cid" xmlns:w16="http://schemas.microsoft.com/office/word/2018/wordml" xmlns:w16du="http://schemas.microsoft.com/office/word/2023/wordml/word16du" xmlns:w16sdtdh="http://schemas.microsoft.com/office/word/2020/wordml/sdtdatahash" xmlns:w16sdtfl="http://schemas.microsoft.com/office/word/2024/wordml/sdtformatlock" xmlns:w16se="http://schemas.microsoft.com/office/word/2015/wordml/symex" xmlns:wpg="http://schemas.microsoft.com/office/word/2010/wordprocessingGroup" xmlns:wpi="http://schemas.microsoft.com/office/word/2010/wordprocessingInk" xmlns:wne="http://schemas.microsoft.com/office/word/2006/wordml" xmlns:wps="http://schemas.microsoft.com/office/word/2010/wordprocessingShape" mc:Ignorable="w14 w15 w16se w16cid w16 w16cex w16sdtdh w16sdtfl w16du wp14">
+  <w15:person w15:author="Rollo Tully">
+    <w15:presenceInfo w15:providerId="AD" w15:userId="S::rollo.tully@student.manchester.ac.uk::cc5e014c-dc23-4bdc-81fa-bd94ff360571"/>
+  </w15:person>
+</w15:people>
+</file>
+
 <file path=word/styles.xml><?xml version="1.0" encoding="utf-8"?>
-<w:styles xmlns:mc="http://schemas.openxmlformats.org/markup-compatibility/2006" xmlns:r="http://schemas.openxmlformats.org/officeDocument/2006/relationships" xmlns:w="http://schemas.openxmlformats.org/wordprocessingml/2006/main" xmlns:w14="http://schemas.microsoft.com/office/word/2010/wordml" xmlns:w15="http://schemas.microsoft.com/office/word/2012/wordml" xmlns:w16cex="http://schemas.microsoft.com/office/word/2018/wordml/cex" xmlns:w16cid="http://schemas.microsoft.com/office/word/2016/wordml/cid" xmlns:w16="http://schemas.microsoft.com/office/word/2018/wordml" xmlns:w16du="http://schemas.microsoft.com/office/word/2023/wordml/word16du" xmlns:w16sdtdh="http://schemas.microsoft.com/office/word/2020/wordml/sdtdatahash" xmlns:w16se="http://schemas.microsoft.com/office/word/2015/wordml/symex" mc:Ignorable="w14 w15 w16se w16cid w16 w16cex w16sdtdh w16du">
+<w:styles xmlns:mc="http://schemas.openxmlformats.org/markup-compatibility/2006" xmlns:r="http://schemas.openxmlformats.org/officeDocument/2006/relationships" xmlns:w="http://schemas.openxmlformats.org/wordprocessingml/2006/main" xmlns:w14="http://schemas.microsoft.com/office/word/2010/wordml" xmlns:w15="http://schemas.microsoft.com/office/word/2012/wordml" xmlns:w16cex="http://schemas.microsoft.com/office/word/2018/wordml/cex" xmlns:w16cid="http://schemas.microsoft.com/office/word/2016/wordml/cid" xmlns:w16="http://schemas.microsoft.com/office/word/2018/wordml" xmlns:w16du="http://schemas.microsoft.com/office/word/2023/wordml/word16du" xmlns:w16sdtdh="http://schemas.microsoft.com/office/word/2020/wordml/sdtdatahash" xmlns:w16sdtfl="http://schemas.microsoft.com/office/word/2024/wordml/sdtformatlock" xmlns:w16se="http://schemas.microsoft.com/office/word/2015/wordml/symex" mc:Ignorable="w14 w15 w16se w16cid w16 w16cex w16sdtdh w16sdtfl w16du">
   <w:docDefaults>
     <w:rPrDefault>
       <w:rPr>
@@ -4435,6 +4482,7 @@
   <w:style w:type="character" w:default="1" w:styleId="DefaultParagraphFont">
     <w:name w:val="Default Paragraph Font"/>
     <w:uiPriority w:val="1"/>
+    <w:semiHidden/>
     <w:unhideWhenUsed/>
   </w:style>
   <w:style w:type="table" w:default="1" w:styleId="TableNormal">

</xml_diff>